<commit_message>
Add visa number to health declaration, fix its spacing, lock DPP workplace to CR
zdravotni_template.docx now shows Cislo viza right under Datum narozeni
(same visa_number used elsewhere in the packet), and drops the extra
blank paragraph between the two declaration sentences. DPP's Misto
vykonu prace is now hardcoded to CR regardless of the workplace field,
since that value never varies for this contract type.
</commit_message>
<xml_diff>
--- a/backend/app/templates/bundle/zdravotni_template.docx
+++ b/backend/app/templates/bundle/zdravotni_template.docx
@@ -124,6 +124,20 @@
         <w:rPr>
           <w:rFonts w:asciiTheme="majorHAnsi" w:eastAsia="Arial" w:hAnsiTheme="majorHAnsi" w:cstheme="majorHAnsi"/>
         </w:rPr>
+        <w:t>Číslo víza: {{CISLO_VIZA}}</w:t>
+      </w:r>
+    </w:p>
+    <w:p>
+      <w:pPr>
+        <w:spacing w:after="0" w:line="240" w:lineRule="auto"/>
+        <w:rPr>
+          <w:rFonts w:asciiTheme="majorHAnsi" w:eastAsia="Arial" w:hAnsiTheme="majorHAnsi" w:cstheme="majorHAnsi"/>
+        </w:rPr>
+      </w:pPr>
+      <w:r>
+        <w:rPr>
+          <w:rFonts w:asciiTheme="majorHAnsi" w:eastAsia="Arial" w:hAnsiTheme="majorHAnsi" w:cstheme="majorHAnsi"/>
+        </w:rPr>
         <w:t>Adresa dočasného místa pobytu v ČR: {{ADRESA}}</w:t>
       </w:r>
       <w:proofErr w:type="gramStart"/>
@@ -215,15 +229,6 @@
         </w:rPr>
         <w:t>Prohlašuji, že mám přidělenou zákonem danou zdravotní pojišťovnu.</w:t>
       </w:r>
-    </w:p>
-    <w:p>
-      <w:pPr>
-        <w:spacing w:after="0" w:line="240" w:lineRule="auto"/>
-        <w:jc w:val="both"/>
-        <w:rPr>
-          <w:rFonts w:asciiTheme="majorHAnsi" w:eastAsia="Arial" w:hAnsiTheme="majorHAnsi" w:cstheme="majorHAnsi"/>
-        </w:rPr>
-      </w:pPr>
     </w:p>
     <w:p>
       <w:pPr>

</xml_diff>